<commit_message>
Class 375 guard buzzer, regenerated manual PDFs, Running Train HR1500 and KR5000 profiles, app settings
Co-Authored-By: Claude Fable 5.1 <noreply@anthropic.com>

Claude-Session: https://claude.ai/code/session_018g4KeLEniBKRf6nuJD1TEU
</commit_message>
<xml_diff>
--- a/profiles/documentation/tsw-class-171-rivet-thejag.docx
+++ b/profiles/documentation/tsw-class-171-rivet-thejag.docx
@@ -363,9 +363,9 @@
                 <w:noProof/>
               </w:rPr>
               <w:drawing>
-                <wp:inline distT="0" distB="0" distL="0" distR="0" wp14:anchorId="0FF09543" wp14:editId="19A56909">
-                  <wp:extent cx="1812428" cy="187200"/>
-                  <wp:effectExtent l="0" t="0" r="0" b="3810"/>
+                <wp:inline distT="0" distB="0" distL="0" distR="0" wp14:anchorId="0FF09543" wp14:editId="0F72E470">
+                  <wp:extent cx="3136895" cy="324000"/>
+                  <wp:effectExtent l="0" t="0" r="6985" b="0"/>
                   <wp:docPr id="1461324980" name="Picture 2"/>
                   <wp:cNvGraphicFramePr>
                     <a:graphicFrameLocks xmlns:a="http://schemas.openxmlformats.org/drawingml/2006/main" noChangeAspect="1"/>
@@ -395,7 +395,7 @@
                         <pic:spPr bwMode="auto">
                           <a:xfrm>
                             <a:off x="0" y="0"/>
-                            <a:ext cx="1812428" cy="187200"/>
+                            <a:ext cx="3136895" cy="324000"/>
                           </a:xfrm>
                           <a:prstGeom prst="rect">
                             <a:avLst/>
@@ -416,9 +416,9 @@
                 <w:noProof/>
               </w:rPr>
               <w:drawing>
-                <wp:inline distT="0" distB="0" distL="0" distR="0" wp14:anchorId="7EB28578" wp14:editId="79BB2C33">
-                  <wp:extent cx="1812428" cy="187200"/>
-                  <wp:effectExtent l="0" t="0" r="0" b="3810"/>
+                <wp:inline distT="0" distB="0" distL="0" distR="0" wp14:anchorId="7EB28578" wp14:editId="6127C727">
+                  <wp:extent cx="3136895" cy="324000"/>
+                  <wp:effectExtent l="0" t="0" r="6985" b="0"/>
                   <wp:docPr id="328606861" name="Picture 2"/>
                   <wp:cNvGraphicFramePr>
                     <a:graphicFrameLocks xmlns:a="http://schemas.openxmlformats.org/drawingml/2006/main" noChangeAspect="1"/>
@@ -448,7 +448,7 @@
                         <pic:spPr bwMode="auto">
                           <a:xfrm>
                             <a:off x="0" y="0"/>
-                            <a:ext cx="1812428" cy="187200"/>
+                            <a:ext cx="3136895" cy="324000"/>
                           </a:xfrm>
                           <a:prstGeom prst="rect">
                             <a:avLst/>
@@ -7950,6 +7950,7 @@
   <w:style w:type="character" w:default="1" w:styleId="DefaultParagraphFont">
     <w:name w:val="Default Paragraph Font"/>
     <w:uiPriority w:val="1"/>
+    <w:semiHidden/>
     <w:unhideWhenUsed/>
   </w:style>
   <w:style w:type="table" w:default="1" w:styleId="TableNormal">

</xml_diff>